<commit_message>
White paper: add the system-workflow diagram to Section 3
Embeds docs/system-workflow.png as Figure 1 in the System Overview section so the
end-to-end flow (document proofing → liveness → gesture → face match → decision →
enrollment, plus the returning-user flows) is visible at a glance. Sized to fit
the page with a caption; rebuilt via scripts/build_project_white_paper_docx.js,
validated, 8 pages.

Co-Authored-By: Claude Opus 4.8 <noreply@anthropic.com>
</commit_message>
<xml_diff>
--- a/docs/kyron-ekyc-white-paper-draft.docx
+++ b/docs/kyron-ekyc-white-paper-draft.docx
@@ -527,6 +527,68 @@
       </w:pPr>
       <w:r>
         <w:t xml:space="preserve">Verified profiles (a protected face template plus minimal document attributes) are stored in a SQL profile store (SQLite for development, PostgreSQL for production). Raw document, selfie, and liveness images are analyzed in memory and never written to disk.</w:t>
+      </w:r>
+    </w:p>
+    <w:p>
+      <w:pPr>
+        <w:spacing w:after="40" w:before="160"/>
+        <w:jc w:val="center"/>
+      </w:pPr>
+      <w:r>
+        <w:drawing>
+          <wp:inline distT="0" distB="0" distL="0" distR="0">
+            <wp:extent cx="5715000" cy="4038600"/>
+            <wp:effectExtent t="0" r="0" b="0" l="0"/>
+            <wp:docPr id="1" name="SystemWorkflow" descr="End-to-end verification workflow: document proofing, liveness, gesture, face match, decision, enrollment." title="Kyron eKYC system workflow"/>
+            <wp:cNvGraphicFramePr>
+              <a:graphicFrameLocks xmlns:a="http://schemas.openxmlformats.org/drawingml/2006/main" noChangeAspect="1"/>
+            </wp:cNvGraphicFramePr>
+            <a:graphic xmlns:a="http://schemas.openxmlformats.org/drawingml/2006/main">
+              <a:graphicData uri="http://schemas.openxmlformats.org/drawingml/2006/picture">
+                <pic:pic xmlns:pic="http://schemas.openxmlformats.org/drawingml/2006/picture">
+                  <pic:nvPicPr>
+                    <pic:cNvPr id="0" name="" descr=""/>
+                    <pic:cNvPicPr>
+                      <a:picLocks noChangeAspect="1" noChangeArrowheads="1"/>
+                    </pic:cNvPicPr>
+                  </pic:nvPicPr>
+                  <pic:blipFill>
+                    <a:blip r:embed="rId8" cstate="none"/>
+                    <a:srcRect/>
+                    <a:stretch>
+                      <a:fillRect/>
+                    </a:stretch>
+                  </pic:blipFill>
+                  <pic:spPr bwMode="auto">
+                    <a:xfrm>
+                      <a:off x="0" y="0"/>
+                      <a:ext cx="5715000" cy="4038600"/>
+                    </a:xfrm>
+                    <a:prstGeom prst="rect">
+                      <a:avLst/>
+                    </a:prstGeom>
+                  </pic:spPr>
+                </pic:pic>
+              </a:graphicData>
+            </a:graphic>
+          </wp:inline>
+        </w:drawing>
+      </w:r>
+    </w:p>
+    <w:p>
+      <w:pPr>
+        <w:spacing w:after="160"/>
+        <w:jc w:val="center"/>
+      </w:pPr>
+      <w:r>
+        <w:rPr>
+          <w:i/>
+          <w:iCs/>
+          <w:color w:val="5A6478"/>
+          <w:sz w:val="18"/>
+          <w:szCs w:val="18"/>
+        </w:rPr>
+        <w:t xml:space="preserve">Figure 1. Kyron eKYC system workflow — from document capture through the risk decision and enrollment.</w:t>
       </w:r>
     </w:p>
     <w:p>

</xml_diff>